<commit_message>
Update audit report: Finding 1 resolved (uploaded baseline synchronized to amended 11-Sep version)
</commit_message>
<xml_diff>
--- a/Requirements/acrme_consistency_audit_2026-09-17.docx
+++ b/Requirements/acrme_consistency_audit_2026-09-17.docx
@@ -235,23 +235,38 @@
         <w:t xml:space="preserve"> </w:t>
       </w:r>
       <w:r>
-        <w:t xml:space="preserve">issues: one that requires your decision (a stale</w:t>
-      </w:r>
-      <w:r>
-        <w:t xml:space="preserve"> </w:t>
-      </w:r>
-      <w:r>
-        <w:rPr>
-          <w:iCs/>
-          <w:i/>
-        </w:rPr>
-        <w:t xml:space="preserve">uploaded</w:t>
-      </w:r>
-      <w:r>
-        <w:t xml:space="preserve"> </w:t>
-      </w:r>
-      <w:r>
-        <w:t xml:space="preserve">baseline vs. the repo baseline), and one internal typo that has been fixed in this change.</w:t>
+        <w:t xml:space="preserve">issues, both now</w:t>
+      </w:r>
+      <w:r>
+        <w:t xml:space="preserve"> </w:t>
+      </w:r>
+      <w:r>
+        <w:rPr>
+          <w:bCs/>
+          <w:b/>
+        </w:rPr>
+        <w:t xml:space="preserve">RESOLVED</w:t>
+      </w:r>
+      <w:r>
+        <w:t xml:space="preserve">: (1) the uploaded</w:t>
+      </w:r>
+      <w:r>
+        <w:t xml:space="preserve"> </w:t>
+      </w:r>
+      <w:r>
+        <w:t xml:space="preserve">“</w:t>
+      </w:r>
+      <w:r>
+        <w:t xml:space="preserve">source of truth</w:t>
+      </w:r>
+      <w:r>
+        <w:t xml:space="preserve">”</w:t>
+      </w:r>
+      <w:r>
+        <w:t xml:space="preserve"> </w:t>
+      </w:r>
+      <w:r>
+        <w:t xml:space="preserve">baseline was stale vs. the repo baseline — now synchronized to the amended 11-Sep version; (2) one internal typo (5-min vs. 6-min reconciliation interval) — corrected. All documents now reconcile to the authoritative baseline v2.4 (amended), 11 September 2026.</w:t>
       </w:r>
     </w:p>
     <w:p>
@@ -261,7 +276,7 @@
         </w:pict>
       </w:r>
     </w:p>
-    <w:bookmarkStart w:id="20" w:name="X3f655106da0824fc683f30841adab7f11d81dc5"/>
+    <w:bookmarkStart w:id="20" w:name="Xa4e19d8f6e468537bc6d631c401e7cf8239677b"/>
     <w:p>
       <w:pPr>
         <w:pStyle w:val="Heading2"/>
@@ -285,7 +300,7 @@
         <w:t xml:space="preserve"> </w:t>
       </w:r>
       <w:r>
-        <w:t xml:space="preserve">baseline is STALE vs. the repo baseline</w:t>
+        <w:t xml:space="preserve">baseline was STALE vs. the repo baseline [RESOLVED]</w:t>
       </w:r>
     </w:p>
     <w:p>
@@ -783,29 +798,13 @@
           <w:bCs/>
           <w:b/>
         </w:rPr>
-        <w:t xml:space="preserve">Action needed from you (cannot be auto-resolved — it’s a question of which document is authoritative):</w:t>
-      </w:r>
-      <w:r>
-        <w:t xml:space="preserve"> </w:t>
-      </w:r>
-      <w:r>
-        <w:t xml:space="preserve">1. If the amended 11-Sep baseline is authoritative →</w:t>
-      </w:r>
-      <w:r>
-        <w:t xml:space="preserve"> </w:t>
-      </w:r>
-      <w:r>
-        <w:rPr>
-          <w:bCs/>
-          <w:b/>
-        </w:rPr>
-        <w:t xml:space="preserve">re-upload it</w:t>
-      </w:r>
-      <w:r>
-        <w:t xml:space="preserve"> </w:t>
-      </w:r>
-      <w:r>
-        <w:t xml:space="preserve">to</w:t>
+        <w:t xml:space="preserve">Resolution (confirmed by user):</w:t>
+      </w:r>
+      <w:r>
+        <w:t xml:space="preserve"> </w:t>
+      </w:r>
+      <w:r>
+        <w:t xml:space="preserve">The amended 11-Sep baseline is authoritative. The uploaded file at</w:t>
       </w:r>
       <w:r>
         <w:t xml:space="preserve"> </w:t>
@@ -814,19 +813,45 @@
         <w:rPr>
           <w:rStyle w:val="VerbatimChar"/>
         </w:rPr>
-        <w:t xml:space="preserve">/home/ubuntu/Uploads/…</w:t>
-      </w:r>
-      <w:r>
-        <w:t xml:space="preserve"> </w:t>
-      </w:r>
-      <w:r>
-        <w:t xml:space="preserve">so the designated source of truth matches the repo. (Recommended — the whole repo already assumes it.)</w:t>
-      </w:r>
-      <w:r>
-        <w:t xml:space="preserve"> </w:t>
-      </w:r>
-      <w:r>
-        <w:t xml:space="preserve">2. If the 7-Sep uploaded file is authoritative → the Middle East cross-geo work across the repo would need to be reverted, which is a large change; confirm before any such action.</w:t>
+        <w:t xml:space="preserve">/home/ubuntu/Uploads/Azure Capacity &amp; Quota Management- Consolidated Requirements Baseline.md</w:t>
+      </w:r>
+      <w:r>
+        <w:t xml:space="preserve"> </w:t>
+      </w:r>
+      <w:r>
+        <w:t xml:space="preserve">has been</w:t>
+      </w:r>
+      <w:r>
+        <w:t xml:space="preserve"> </w:t>
+      </w:r>
+      <w:r>
+        <w:rPr>
+          <w:bCs/>
+          <w:b/>
+        </w:rPr>
+        <w:t xml:space="preserve">synchronized</w:t>
+      </w:r>
+      <w:r>
+        <w:t xml:space="preserve"> </w:t>
+      </w:r>
+      <w:r>
+        <w:t xml:space="preserve">with the repo baseline — both now carry</w:t>
+      </w:r>
+      <w:r>
+        <w:t xml:space="preserve"> </w:t>
+      </w:r>
+      <w:r>
+        <w:rPr>
+          <w:bCs/>
+          <w:b/>
+        </w:rPr>
+        <w:t xml:space="preserve">v2.4 (amended), 11 September 2026</w:t>
+      </w:r>
+      <w:r>
+        <w:t xml:space="preserve"> </w:t>
+      </w:r>
+      <w:r>
+        <w:t xml:space="preserve">with Middle East cross-geo DR, DEC-001 RESOLVED, DR-020, PLC-010b, A-ME1. The standing instruction source of truth and the repo are now aligned.</w:t>
       </w:r>
     </w:p>
     <w:p>

</xml_diff>